<commit_message>
99% of all edits made. Will check again for piece 2-3 tomorrow.
</commit_message>
<xml_diff>
--- a/Working Folder/3 Zhu Yiqing 朱一清 - The Silence of Borobudur 沉默的婆罗浮屠/3_Front-Matter.docx
+++ b/Working Folder/3 Zhu Yiqing 朱一清 - The Silence of Borobudur 沉默的婆罗浮屠/3_Front-Matter.docx
@@ -3678,16 +3678,46 @@
       </w:r>
       <w:r>
         <w:rPr>
-          <w:rFonts w:ascii="Noto Serif SC" w:eastAsia="Noto Serif SC" w:hAnsi="Noto Serif SC" w:cs="Noto Serif"/>
+          <w:rFonts w:ascii="Noto Serif SC" w:eastAsia="Noto Serif SC" w:hAnsi="Noto Serif SC" w:cs="Noto Serif" w:hint="eastAsia"/>
           <w:lang w:val="en-GB"/>
         </w:rPr>
-        <w:t xml:space="preserve">I Gaoyin Suona I, </w:t>
-      </w:r>
-      <w:r>
-        <w:rPr>
-          <w:rFonts w:ascii="Noto Serif SC" w:eastAsia="Noto Serif SC" w:hAnsi="Noto Serif SC" w:cs="Noto Serif" w:hint="eastAsia"/>
+        <w:t xml:space="preserve"> I </w:t>
+      </w:r>
+      <w:proofErr w:type="spellStart"/>
+      <w:r>
+        <w:rPr>
+          <w:rFonts w:ascii="Noto Serif SC" w:eastAsia="Noto Serif SC" w:hAnsi="Noto Serif SC" w:cs="Noto Serif"/>
           <w:lang w:val="en-GB"/>
         </w:rPr>
+        <w:t>Gaoyin</w:t>
+      </w:r>
+      <w:proofErr w:type="spellEnd"/>
+      <w:r>
+        <w:rPr>
+          <w:rFonts w:ascii="Noto Serif SC" w:eastAsia="Noto Serif SC" w:hAnsi="Noto Serif SC" w:cs="Noto Serif"/>
+          <w:lang w:val="en-GB"/>
+        </w:rPr>
+        <w:t xml:space="preserve"> Suona</w:t>
+      </w:r>
+      <w:r>
+        <w:rPr>
+          <w:rFonts w:ascii="Noto Serif SC" w:eastAsia="Noto Serif SC" w:hAnsi="Noto Serif SC" w:cs="Noto Serif" w:hint="eastAsia"/>
+          <w:lang w:val="en-GB"/>
+        </w:rPr>
+        <w:t xml:space="preserve"> I</w:t>
+      </w:r>
+      <w:r>
+        <w:rPr>
+          <w:rFonts w:ascii="Noto Serif SC" w:eastAsia="Noto Serif SC" w:hAnsi="Noto Serif SC" w:cs="Noto Serif"/>
+          <w:lang w:val="en-GB"/>
+        </w:rPr>
+        <w:t xml:space="preserve">, </w:t>
+      </w:r>
+      <w:r>
+        <w:rPr>
+          <w:rFonts w:ascii="Noto Serif SC" w:eastAsia="Noto Serif SC" w:hAnsi="Noto Serif SC" w:cs="Noto Serif" w:hint="eastAsia"/>
+          <w:lang w:val="en-GB"/>
+        </w:rPr>
         <w:t>高音管</w:t>
       </w:r>
       <w:r>
@@ -3695,7 +3725,23 @@
           <w:rFonts w:ascii="Noto Serif SC" w:eastAsia="Noto Serif SC" w:hAnsi="Noto Serif SC" w:cs="Noto Serif"/>
           <w:lang w:val="en-GB"/>
         </w:rPr>
-        <w:t xml:space="preserve"> Gaoyin Guan</w:t>
+        <w:t xml:space="preserve"> </w:t>
+      </w:r>
+      <w:proofErr w:type="spellStart"/>
+      <w:r>
+        <w:rPr>
+          <w:rFonts w:ascii="Noto Serif SC" w:eastAsia="Noto Serif SC" w:hAnsi="Noto Serif SC" w:cs="Noto Serif"/>
+          <w:lang w:val="en-GB"/>
+        </w:rPr>
+        <w:t>Gaoyin</w:t>
+      </w:r>
+      <w:proofErr w:type="spellEnd"/>
+      <w:r>
+        <w:rPr>
+          <w:rFonts w:ascii="Noto Serif SC" w:eastAsia="Noto Serif SC" w:hAnsi="Noto Serif SC" w:cs="Noto Serif"/>
+          <w:lang w:val="en-GB"/>
+        </w:rPr>
+        <w:t xml:space="preserve"> Guan</w:t>
       </w:r>
     </w:p>
     <w:p>
@@ -3743,7 +3789,7 @@
     <w:p>
       <w:pPr>
         <w:rPr>
-          <w:rFonts w:ascii="Noto Serif SC" w:eastAsia="Noto Serif SC" w:hAnsi="Noto Serif SC" w:cs="Noto Serif"/>
+          <w:rFonts w:ascii="Noto Serif SC" w:eastAsia="Noto Serif SC" w:hAnsi="Noto Serif SC" w:cs="Noto Serif" w:hint="eastAsia"/>
           <w:lang w:val="en-US"/>
         </w:rPr>
       </w:pPr>
@@ -3822,6 +3868,39 @@
       <w:r>
         <w:rPr>
           <w:rFonts w:ascii="Noto Serif SC" w:eastAsia="Noto Serif SC" w:hAnsi="Noto Serif SC" w:cs="Noto Serif" w:hint="eastAsia"/>
+        </w:rPr>
+        <w:t>低音管</w:t>
+      </w:r>
+      <w:r>
+        <w:rPr>
+          <w:rFonts w:ascii="Noto Serif SC" w:eastAsia="Noto Serif SC" w:hAnsi="Noto Serif SC" w:cs="Noto Serif" w:hint="eastAsia"/>
+        </w:rPr>
+        <w:t xml:space="preserve">I </w:t>
+      </w:r>
+      <w:r>
+        <w:rPr>
+          <w:rFonts w:ascii="Noto Serif SC" w:eastAsia="Noto Serif SC" w:hAnsi="Noto Serif SC" w:cs="Noto Serif"/>
+          <w:lang w:val="en-GB"/>
+        </w:rPr>
+        <w:t>Diyin Guan</w:t>
+      </w:r>
+      <w:r>
+        <w:rPr>
+          <w:rFonts w:ascii="Noto Serif SC" w:eastAsia="Noto Serif SC" w:hAnsi="Noto Serif SC" w:cs="Noto Serif" w:hint="eastAsia"/>
+          <w:lang w:val="en-GB"/>
+        </w:rPr>
+        <w:t xml:space="preserve"> I</w:t>
+      </w:r>
+      <w:r>
+        <w:rPr>
+          <w:rFonts w:ascii="Noto Serif SC" w:eastAsia="Noto Serif SC" w:hAnsi="Noto Serif SC" w:cs="Noto Serif"/>
+          <w:lang w:val="en-GB"/>
+        </w:rPr>
+        <w:t xml:space="preserve">, </w:t>
+      </w:r>
+      <w:r>
+        <w:rPr>
+          <w:rFonts w:ascii="Noto Serif SC" w:eastAsia="Noto Serif SC" w:hAnsi="Noto Serif SC" w:cs="Noto Serif" w:hint="eastAsia"/>
           <w:lang w:val="en-US"/>
         </w:rPr>
         <w:t>中音唢呐</w:t>
@@ -3831,14 +3910,159 @@
           <w:rFonts w:ascii="Noto Serif SC" w:eastAsia="Noto Serif SC" w:hAnsi="Noto Serif SC" w:cs="Noto Serif"/>
           <w:lang w:val="en-US"/>
         </w:rPr>
-        <w:t xml:space="preserve">  </w:t>
-      </w:r>
-      <w:r>
-        <w:rPr>
-          <w:rFonts w:ascii="Noto Serif SC" w:eastAsia="Noto Serif SC" w:hAnsi="Noto Serif SC" w:cs="Noto Serif"/>
-          <w:lang w:val="en-US"/>
-        </w:rPr>
-        <w:t>Zhongyin Suona</w:t>
+        <w:t xml:space="preserve"> </w:t>
+      </w:r>
+      <w:r>
+        <w:rPr>
+          <w:rFonts w:ascii="Noto Serif SC" w:eastAsia="Noto Serif SC" w:hAnsi="Noto Serif SC" w:cs="Noto Serif" w:hint="eastAsia"/>
+          <w:lang w:val="en-US"/>
+        </w:rPr>
+        <w:t>I</w:t>
+      </w:r>
+      <w:r>
+        <w:rPr>
+          <w:rFonts w:ascii="Noto Serif SC" w:eastAsia="Noto Serif SC" w:hAnsi="Noto Serif SC" w:cs="Noto Serif"/>
+          <w:lang w:val="en-US"/>
+        </w:rPr>
+        <w:t xml:space="preserve"> </w:t>
+      </w:r>
+      <w:proofErr w:type="spellStart"/>
+      <w:r>
+        <w:rPr>
+          <w:rFonts w:ascii="Noto Serif SC" w:eastAsia="Noto Serif SC" w:hAnsi="Noto Serif SC" w:cs="Noto Serif"/>
+          <w:lang w:val="en-US"/>
+        </w:rPr>
+        <w:t>Zhongyin</w:t>
+      </w:r>
+      <w:proofErr w:type="spellEnd"/>
+      <w:r>
+        <w:rPr>
+          <w:rFonts w:ascii="Noto Serif SC" w:eastAsia="Noto Serif SC" w:hAnsi="Noto Serif SC" w:cs="Noto Serif"/>
+          <w:lang w:val="en-US"/>
+        </w:rPr>
+        <w:t xml:space="preserve"> Suona</w:t>
+      </w:r>
+      <w:r>
+        <w:rPr>
+          <w:rFonts w:ascii="Noto Serif SC" w:eastAsia="Noto Serif SC" w:hAnsi="Noto Serif SC" w:cs="Noto Serif" w:hint="eastAsia"/>
+          <w:lang w:val="en-US"/>
+        </w:rPr>
+        <w:t xml:space="preserve"> I</w:t>
+      </w:r>
+    </w:p>
+    <w:p>
+      <w:pPr>
+        <w:rPr>
+          <w:rFonts w:ascii="Noto Serif SC" w:eastAsia="Noto Serif SC" w:hAnsi="Noto Serif SC" w:cs="Noto Serif" w:hint="eastAsia"/>
+          <w:sz w:val="24"/>
+          <w:szCs w:val="24"/>
+          <w:lang w:val="en-GB"/>
+        </w:rPr>
+      </w:pPr>
+      <w:r>
+        <w:rPr>
+          <w:rFonts w:ascii="Noto Serif SC" w:eastAsia="Noto Serif SC" w:hAnsi="Noto Serif SC" w:cs="Noto Serif"/>
+          <w:sz w:val="24"/>
+          <w:szCs w:val="24"/>
+          <w:lang w:val="en-US"/>
+        </w:rPr>
+        <w:t>唢呐/管 I</w:t>
+      </w:r>
+      <w:r>
+        <w:rPr>
+          <w:rFonts w:ascii="Noto Serif SC" w:eastAsia="Noto Serif SC" w:hAnsi="Noto Serif SC" w:cs="Noto Serif"/>
+          <w:sz w:val="24"/>
+          <w:szCs w:val="24"/>
+          <w:lang w:val="en-US"/>
+        </w:rPr>
+        <w:t xml:space="preserve">V </w:t>
+      </w:r>
+      <w:r>
+        <w:rPr>
+          <w:rFonts w:ascii="Noto Serif SC" w:eastAsia="Noto Serif SC" w:hAnsi="Noto Serif SC" w:cs="Noto Serif"/>
+          <w:sz w:val="24"/>
+          <w:szCs w:val="24"/>
+          <w:lang w:val="en-US"/>
+        </w:rPr>
+        <w:t>S</w:t>
+      </w:r>
+      <w:r>
+        <w:rPr>
+          <w:rFonts w:ascii="Noto Serif SC" w:eastAsia="Noto Serif SC" w:hAnsi="Noto Serif SC" w:cs="Noto Serif"/>
+          <w:sz w:val="24"/>
+          <w:szCs w:val="24"/>
+          <w:lang w:val="en-US"/>
+        </w:rPr>
+        <w:t>uona</w:t>
+      </w:r>
+      <w:r>
+        <w:rPr>
+          <w:rFonts w:ascii="Noto Serif SC" w:eastAsia="Noto Serif SC" w:hAnsi="Noto Serif SC" w:cs="Noto Serif"/>
+          <w:sz w:val="24"/>
+          <w:szCs w:val="24"/>
+          <w:lang w:val="en-US"/>
+        </w:rPr>
+        <w:t xml:space="preserve">/Guan </w:t>
+      </w:r>
+      <w:r>
+        <w:rPr>
+          <w:rFonts w:ascii="Noto Serif SC" w:eastAsia="Noto Serif SC" w:hAnsi="Noto Serif SC" w:cs="Noto Serif"/>
+          <w:sz w:val="24"/>
+          <w:szCs w:val="24"/>
+          <w:lang w:val="en-US"/>
+        </w:rPr>
+        <w:t xml:space="preserve">IV: </w:t>
+      </w:r>
+      <w:r>
+        <w:rPr>
+          <w:rFonts w:ascii="Noto Serif SC" w:eastAsia="Noto Serif SC" w:hAnsi="Noto Serif SC" w:cs="Noto Serif" w:hint="eastAsia"/>
+          <w:lang w:val="en-US"/>
+        </w:rPr>
+        <w:t>中音唢呐</w:t>
+      </w:r>
+      <w:r>
+        <w:rPr>
+          <w:rFonts w:ascii="Noto Serif SC" w:eastAsia="Noto Serif SC" w:hAnsi="Noto Serif SC" w:cs="Noto Serif"/>
+          <w:lang w:val="en-US"/>
+        </w:rPr>
+        <w:t xml:space="preserve"> </w:t>
+      </w:r>
+      <w:r>
+        <w:rPr>
+          <w:rFonts w:ascii="Noto Serif SC" w:eastAsia="Noto Serif SC" w:hAnsi="Noto Serif SC" w:cs="Noto Serif" w:hint="eastAsia"/>
+          <w:lang w:val="en-US"/>
+        </w:rPr>
+        <w:t>II</w:t>
+      </w:r>
+      <w:r>
+        <w:rPr>
+          <w:rFonts w:ascii="Noto Serif SC" w:eastAsia="Noto Serif SC" w:hAnsi="Noto Serif SC" w:cs="Noto Serif"/>
+          <w:lang w:val="en-US"/>
+        </w:rPr>
+        <w:t xml:space="preserve"> </w:t>
+      </w:r>
+      <w:proofErr w:type="spellStart"/>
+      <w:r>
+        <w:rPr>
+          <w:rFonts w:ascii="Noto Serif SC" w:eastAsia="Noto Serif SC" w:hAnsi="Noto Serif SC" w:cs="Noto Serif"/>
+          <w:lang w:val="en-US"/>
+        </w:rPr>
+        <w:t>Zhongyin</w:t>
+      </w:r>
+      <w:proofErr w:type="spellEnd"/>
+      <w:r>
+        <w:rPr>
+          <w:rFonts w:ascii="Noto Serif SC" w:eastAsia="Noto Serif SC" w:hAnsi="Noto Serif SC" w:cs="Noto Serif"/>
+          <w:lang w:val="en-US"/>
+        </w:rPr>
+        <w:t xml:space="preserve"> Suona</w:t>
+      </w:r>
+      <w:r>
+        <w:rPr>
+          <w:rFonts w:ascii="Noto Serif SC" w:eastAsia="Noto Serif SC" w:hAnsi="Noto Serif SC" w:cs="Noto Serif" w:hint="eastAsia"/>
+          <w:lang w:val="en-US"/>
+        </w:rPr>
+        <w:t xml:space="preserve"> II</w:t>
       </w:r>
       <w:r>
         <w:rPr>
@@ -3849,16 +4073,47 @@
       </w:r>
       <w:r>
         <w:rPr>
+          <w:rFonts w:ascii="Noto Serif SC" w:eastAsia="Noto Serif SC" w:hAnsi="Noto Serif SC" w:cs="Noto Serif"/>
+        </w:rPr>
+        <w:t>低音唢呐</w:t>
+      </w:r>
+      <w:r>
+        <w:rPr>
+          <w:rFonts w:ascii="Noto Serif SC" w:eastAsia="Noto Serif SC" w:hAnsi="Noto Serif SC" w:cs="Noto Serif"/>
+          <w:lang w:val="en-GB"/>
+        </w:rPr>
+        <w:t>Diyin Suona</w:t>
+      </w:r>
+      <w:r>
+        <w:rPr>
+          <w:rFonts w:ascii="Noto Serif SC" w:eastAsia="Noto Serif SC" w:hAnsi="Noto Serif SC" w:cs="Noto Serif"/>
+          <w:lang w:val="en-GB"/>
+        </w:rPr>
+        <w:t xml:space="preserve">, </w:t>
+      </w:r>
+      <w:r>
+        <w:rPr>
           <w:rFonts w:ascii="Noto Serif SC" w:eastAsia="Noto Serif SC" w:hAnsi="Noto Serif SC" w:cs="Noto Serif" w:hint="eastAsia"/>
         </w:rPr>
         <w:t>低音管</w:t>
       </w:r>
       <w:r>
         <w:rPr>
-          <w:rFonts w:ascii="Noto Serif SC" w:eastAsia="Noto Serif SC" w:hAnsi="Noto Serif SC" w:cs="Noto Serif"/>
-          <w:lang w:val="en-US"/>
-        </w:rPr>
-        <w:t xml:space="preserve">I </w:t>
+          <w:rFonts w:ascii="Noto Serif SC" w:eastAsia="Noto Serif SC" w:hAnsi="Noto Serif SC" w:cs="Noto Serif" w:hint="eastAsia"/>
+        </w:rPr>
+        <w:t>I</w:t>
+      </w:r>
+      <w:r>
+        <w:rPr>
+          <w:rFonts w:ascii="Noto Serif SC" w:eastAsia="Noto Serif SC" w:hAnsi="Noto Serif SC" w:cs="Noto Serif"/>
+        </w:rPr>
+        <w:t>I</w:t>
+      </w:r>
+      <w:r>
+        <w:rPr>
+          <w:rFonts w:ascii="Noto Serif SC" w:eastAsia="Noto Serif SC" w:hAnsi="Noto Serif SC" w:cs="Noto Serif" w:hint="eastAsia"/>
+        </w:rPr>
+        <w:t xml:space="preserve"> </w:t>
       </w:r>
       <w:r>
         <w:rPr>
@@ -3869,238 +4124,159 @@
       </w:r>
       <w:r>
         <w:rPr>
-          <w:rFonts w:ascii="Noto Serif SC" w:eastAsia="Noto Serif SC" w:hAnsi="Noto Serif SC" w:cs="Noto Serif"/>
+          <w:rFonts w:ascii="Noto Serif SC" w:eastAsia="Noto Serif SC" w:hAnsi="Noto Serif SC" w:cs="Noto Serif" w:hint="eastAsia"/>
           <w:lang w:val="en-GB"/>
         </w:rPr>
-        <w:t xml:space="preserve"> I</w:t>
-      </w:r>
-    </w:p>
-    <w:p>
-      <w:pPr>
-        <w:rPr>
-          <w:rFonts w:ascii="Noto Serif SC" w:eastAsia="Noto Serif SC" w:hAnsi="Noto Serif SC" w:cs="Noto Serif"/>
-          <w:sz w:val="24"/>
-          <w:szCs w:val="24"/>
+        <w:t xml:space="preserve"> II</w:t>
+      </w:r>
+    </w:p>
+    <w:p>
+      <w:pPr>
+        <w:rPr>
+          <w:rFonts w:ascii="Noto Serif SC" w:eastAsia="Noto Serif SC" w:hAnsi="Noto Serif SC" w:cs="Noto Serif"/>
+          <w:sz w:val="24"/>
+          <w:szCs w:val="24"/>
+          <w:lang w:val="en-US"/>
+        </w:rPr>
+      </w:pPr>
+      <w:r>
+        <w:rPr>
+          <w:rFonts w:ascii="Noto Serif SC" w:eastAsia="Noto Serif SC" w:hAnsi="Noto Serif SC" w:cs="Noto Serif"/>
+          <w:sz w:val="24"/>
+          <w:szCs w:val="24"/>
+          <w:lang w:val="en-US"/>
+        </w:rPr>
+        <w:t xml:space="preserve">管 </w:t>
+      </w:r>
+      <w:r>
+        <w:rPr>
+          <w:rFonts w:ascii="Noto Serif SC" w:eastAsia="Noto Serif SC" w:hAnsi="Noto Serif SC" w:cs="Noto Serif"/>
+          <w:sz w:val="24"/>
+          <w:szCs w:val="24"/>
+          <w:lang w:val="en-US"/>
+        </w:rPr>
+        <w:t>V</w:t>
+      </w:r>
+      <w:r>
+        <w:rPr>
+          <w:rFonts w:ascii="Noto Serif SC" w:eastAsia="Noto Serif SC" w:hAnsi="Noto Serif SC" w:cs="Noto Serif"/>
+          <w:sz w:val="24"/>
+          <w:szCs w:val="24"/>
+          <w:lang w:val="en-US"/>
+        </w:rPr>
+        <w:t xml:space="preserve"> </w:t>
+      </w:r>
+      <w:r>
+        <w:rPr>
+          <w:rFonts w:ascii="Noto Serif SC" w:eastAsia="Noto Serif SC" w:hAnsi="Noto Serif SC" w:cs="Noto Serif"/>
+          <w:sz w:val="24"/>
+          <w:szCs w:val="24"/>
+          <w:lang w:val="en-US"/>
+        </w:rPr>
+        <w:t>Guan</w:t>
+      </w:r>
+      <w:r>
+        <w:rPr>
+          <w:rFonts w:ascii="Noto Serif SC" w:eastAsia="Noto Serif SC" w:hAnsi="Noto Serif SC" w:cs="Noto Serif"/>
+          <w:sz w:val="24"/>
+          <w:szCs w:val="24"/>
+          <w:lang w:val="en-US"/>
+        </w:rPr>
+        <w:t xml:space="preserve"> V: </w:t>
+      </w:r>
+      <w:r>
+        <w:rPr>
+          <w:rFonts w:ascii="Noto Serif SC" w:eastAsia="Noto Serif SC" w:hAnsi="Noto Serif SC" w:cs="Noto Serif" w:hint="eastAsia"/>
+          <w:lang w:val="en-US"/>
+        </w:rPr>
+        <w:t>中音</w:t>
+      </w:r>
+      <w:r>
+        <w:rPr>
+          <w:rFonts w:ascii="Noto Serif SC" w:eastAsia="Noto Serif SC" w:hAnsi="Noto Serif SC" w:cs="Noto Serif" w:hint="eastAsia"/>
+        </w:rPr>
+        <w:t>管</w:t>
+      </w:r>
+      <w:r>
+        <w:rPr>
+          <w:rFonts w:ascii="Noto Serif SC" w:eastAsia="Noto Serif SC" w:hAnsi="Noto Serif SC" w:cs="Noto Serif"/>
+          <w:lang w:val="en-US"/>
+        </w:rPr>
+        <w:t xml:space="preserve"> </w:t>
+      </w:r>
+      <w:proofErr w:type="spellStart"/>
+      <w:r>
+        <w:rPr>
+          <w:rFonts w:ascii="Noto Serif SC" w:eastAsia="Noto Serif SC" w:hAnsi="Noto Serif SC" w:cs="Noto Serif"/>
+          <w:lang w:val="en-US"/>
+        </w:rPr>
+        <w:t>Zhongyin</w:t>
+      </w:r>
+      <w:proofErr w:type="spellEnd"/>
+      <w:r>
+        <w:rPr>
+          <w:rFonts w:ascii="Noto Serif SC" w:eastAsia="Noto Serif SC" w:hAnsi="Noto Serif SC" w:cs="Noto Serif"/>
+          <w:lang w:val="en-US"/>
+        </w:rPr>
+        <w:t xml:space="preserve"> </w:t>
+      </w:r>
+      <w:r>
+        <w:rPr>
+          <w:rFonts w:ascii="Noto Serif SC" w:eastAsia="Noto Serif SC" w:hAnsi="Noto Serif SC" w:cs="Noto Serif"/>
+          <w:lang w:val="en-US"/>
+        </w:rPr>
+        <w:t>Guan</w:t>
+      </w:r>
+      <w:r>
+        <w:rPr>
+          <w:rFonts w:ascii="Noto Serif SC" w:eastAsia="Noto Serif SC" w:hAnsi="Noto Serif SC" w:cs="Noto Serif"/>
+          <w:lang w:val="en-US"/>
+        </w:rPr>
+        <w:t xml:space="preserve">, </w:t>
+      </w:r>
+      <w:r>
+        <w:rPr>
+          <w:rFonts w:ascii="Noto Serif SC" w:eastAsia="Noto Serif SC" w:hAnsi="Noto Serif SC" w:cs="Noto Serif" w:hint="eastAsia"/>
           <w:lang w:val="en-GB"/>
         </w:rPr>
-      </w:pPr>
-      <w:r>
-        <w:rPr>
-          <w:rFonts w:ascii="Noto Serif SC" w:eastAsia="Noto Serif SC" w:hAnsi="Noto Serif SC" w:cs="Noto Serif"/>
-          <w:sz w:val="24"/>
-          <w:szCs w:val="24"/>
-          <w:lang w:val="en-US"/>
-        </w:rPr>
-        <w:t>唢呐/管 I</w:t>
-      </w:r>
-      <w:r>
-        <w:rPr>
-          <w:rFonts w:ascii="Noto Serif SC" w:eastAsia="Noto Serif SC" w:hAnsi="Noto Serif SC" w:cs="Noto Serif"/>
-          <w:sz w:val="24"/>
-          <w:szCs w:val="24"/>
-          <w:lang w:val="en-US"/>
-        </w:rPr>
-        <w:t xml:space="preserve">V </w:t>
-      </w:r>
-      <w:r>
-        <w:rPr>
-          <w:rFonts w:ascii="Noto Serif SC" w:eastAsia="Noto Serif SC" w:hAnsi="Noto Serif SC" w:cs="Noto Serif"/>
-          <w:sz w:val="24"/>
-          <w:szCs w:val="24"/>
-          <w:lang w:val="en-US"/>
-        </w:rPr>
-        <w:t>S</w:t>
-      </w:r>
-      <w:r>
-        <w:rPr>
-          <w:rFonts w:ascii="Noto Serif SC" w:eastAsia="Noto Serif SC" w:hAnsi="Noto Serif SC" w:cs="Noto Serif"/>
-          <w:sz w:val="24"/>
-          <w:szCs w:val="24"/>
-          <w:lang w:val="en-US"/>
-        </w:rPr>
-        <w:t>uona</w:t>
-      </w:r>
-      <w:r>
-        <w:rPr>
-          <w:rFonts w:ascii="Noto Serif SC" w:eastAsia="Noto Serif SC" w:hAnsi="Noto Serif SC" w:cs="Noto Serif"/>
-          <w:sz w:val="24"/>
-          <w:szCs w:val="24"/>
-          <w:lang w:val="en-US"/>
-        </w:rPr>
-        <w:t xml:space="preserve">/Guan </w:t>
-      </w:r>
-      <w:r>
-        <w:rPr>
-          <w:rFonts w:ascii="Noto Serif SC" w:eastAsia="Noto Serif SC" w:hAnsi="Noto Serif SC" w:cs="Noto Serif"/>
-          <w:sz w:val="24"/>
-          <w:szCs w:val="24"/>
-          <w:lang w:val="en-US"/>
-        </w:rPr>
-        <w:t xml:space="preserve">IV: </w:t>
-      </w:r>
-      <w:r>
-        <w:rPr>
-          <w:rFonts w:ascii="Noto Serif SC" w:eastAsia="Noto Serif SC" w:hAnsi="Noto Serif SC" w:cs="Noto Serif" w:hint="eastAsia"/>
-          <w:lang w:val="en-US"/>
-        </w:rPr>
-        <w:t>中音唢呐</w:t>
-      </w:r>
-      <w:r>
-        <w:rPr>
-          <w:rFonts w:ascii="Noto Serif SC" w:eastAsia="Noto Serif SC" w:hAnsi="Noto Serif SC" w:cs="Noto Serif"/>
-          <w:lang w:val="en-US"/>
-        </w:rPr>
-        <w:t xml:space="preserve">  Zhongyin Suona, </w:t>
-      </w:r>
-      <w:r>
-        <w:rPr>
-          <w:rFonts w:ascii="Noto Serif SC" w:eastAsia="Noto Serif SC" w:hAnsi="Noto Serif SC" w:cs="Noto Serif"/>
-        </w:rPr>
-        <w:t>低音唢呐</w:t>
+        <w:t>高音管</w:t>
       </w:r>
       <w:r>
         <w:rPr>
           <w:rFonts w:ascii="Noto Serif SC" w:eastAsia="Noto Serif SC" w:hAnsi="Noto Serif SC" w:cs="Noto Serif"/>
           <w:lang w:val="en-GB"/>
         </w:rPr>
-        <w:t>Diyin Suona</w:t>
+        <w:t xml:space="preserve"> </w:t>
       </w:r>
       <w:r>
         <w:rPr>
           <w:rFonts w:ascii="Noto Serif SC" w:eastAsia="Noto Serif SC" w:hAnsi="Noto Serif SC" w:cs="Noto Serif"/>
           <w:lang w:val="en-GB"/>
         </w:rPr>
-        <w:t xml:space="preserve">, </w:t>
-      </w:r>
-      <w:r>
-        <w:rPr>
-          <w:rFonts w:ascii="Noto Serif SC" w:eastAsia="Noto Serif SC" w:hAnsi="Noto Serif SC" w:cs="Noto Serif" w:hint="eastAsia"/>
-        </w:rPr>
-        <w:t>低音管</w:t>
-      </w:r>
-      <w:r>
-        <w:rPr>
-          <w:rFonts w:ascii="Noto Serif SC" w:eastAsia="Noto Serif SC" w:hAnsi="Noto Serif SC" w:cs="Noto Serif"/>
-          <w:lang w:val="en-US"/>
-        </w:rPr>
         <w:t xml:space="preserve">II </w:t>
       </w:r>
+      <w:proofErr w:type="spellStart"/>
       <w:r>
         <w:rPr>
           <w:rFonts w:ascii="Noto Serif SC" w:eastAsia="Noto Serif SC" w:hAnsi="Noto Serif SC" w:cs="Noto Serif"/>
           <w:lang w:val="en-GB"/>
         </w:rPr>
-        <w:t>Diyin Guan</w:t>
-      </w:r>
+        <w:t>Gaoyin</w:t>
+      </w:r>
+      <w:proofErr w:type="spellEnd"/>
       <w:r>
         <w:rPr>
           <w:rFonts w:ascii="Noto Serif SC" w:eastAsia="Noto Serif SC" w:hAnsi="Noto Serif SC" w:cs="Noto Serif"/>
           <w:lang w:val="en-GB"/>
         </w:rPr>
+        <w:t xml:space="preserve"> Guan</w:t>
+      </w:r>
+      <w:r>
+        <w:rPr>
+          <w:rFonts w:ascii="Noto Serif SC" w:eastAsia="Noto Serif SC" w:hAnsi="Noto Serif SC" w:cs="Noto Serif"/>
+          <w:lang w:val="en-GB"/>
+        </w:rPr>
         <w:t xml:space="preserve"> II</w:t>
-      </w:r>
-    </w:p>
-    <w:p>
-      <w:pPr>
-        <w:rPr>
-          <w:rFonts w:ascii="Noto Serif SC" w:eastAsia="Noto Serif SC" w:hAnsi="Noto Serif SC" w:cs="Noto Serif"/>
-          <w:sz w:val="24"/>
-          <w:szCs w:val="24"/>
-          <w:lang w:val="en-US"/>
-        </w:rPr>
-      </w:pPr>
-      <w:r>
-        <w:rPr>
-          <w:rFonts w:ascii="Noto Serif SC" w:eastAsia="Noto Serif SC" w:hAnsi="Noto Serif SC" w:cs="Noto Serif"/>
-          <w:sz w:val="24"/>
-          <w:szCs w:val="24"/>
-          <w:lang w:val="en-US"/>
-        </w:rPr>
-        <w:t xml:space="preserve">管 </w:t>
-      </w:r>
-      <w:r>
-        <w:rPr>
-          <w:rFonts w:ascii="Noto Serif SC" w:eastAsia="Noto Serif SC" w:hAnsi="Noto Serif SC" w:cs="Noto Serif"/>
-          <w:sz w:val="24"/>
-          <w:szCs w:val="24"/>
-          <w:lang w:val="en-US"/>
-        </w:rPr>
-        <w:t>V</w:t>
-      </w:r>
-      <w:r>
-        <w:rPr>
-          <w:rFonts w:ascii="Noto Serif SC" w:eastAsia="Noto Serif SC" w:hAnsi="Noto Serif SC" w:cs="Noto Serif"/>
-          <w:sz w:val="24"/>
-          <w:szCs w:val="24"/>
-          <w:lang w:val="en-US"/>
-        </w:rPr>
-        <w:t xml:space="preserve"> </w:t>
-      </w:r>
-      <w:r>
-        <w:rPr>
-          <w:rFonts w:ascii="Noto Serif SC" w:eastAsia="Noto Serif SC" w:hAnsi="Noto Serif SC" w:cs="Noto Serif"/>
-          <w:sz w:val="24"/>
-          <w:szCs w:val="24"/>
-          <w:lang w:val="en-US"/>
-        </w:rPr>
-        <w:t>Guan</w:t>
-      </w:r>
-      <w:r>
-        <w:rPr>
-          <w:rFonts w:ascii="Noto Serif SC" w:eastAsia="Noto Serif SC" w:hAnsi="Noto Serif SC" w:cs="Noto Serif"/>
-          <w:sz w:val="24"/>
-          <w:szCs w:val="24"/>
-          <w:lang w:val="en-US"/>
-        </w:rPr>
-        <w:t xml:space="preserve"> V: </w:t>
-      </w:r>
-      <w:r>
-        <w:rPr>
-          <w:rFonts w:ascii="Noto Serif SC" w:eastAsia="Noto Serif SC" w:hAnsi="Noto Serif SC" w:cs="Noto Serif" w:hint="eastAsia"/>
-          <w:lang w:val="en-GB"/>
-        </w:rPr>
-        <w:t>高音管</w:t>
-      </w:r>
-      <w:r>
-        <w:rPr>
-          <w:rFonts w:ascii="Noto Serif SC" w:eastAsia="Noto Serif SC" w:hAnsi="Noto Serif SC" w:cs="Noto Serif"/>
-          <w:lang w:val="en-GB"/>
-        </w:rPr>
-        <w:t xml:space="preserve"> Gaoyin Guan</w:t>
-      </w:r>
-      <w:r>
-        <w:rPr>
-          <w:rFonts w:ascii="Noto Serif SC" w:eastAsia="Noto Serif SC" w:hAnsi="Noto Serif SC" w:cs="Noto Serif"/>
-          <w:lang w:val="en-GB"/>
-        </w:rPr>
-        <w:t xml:space="preserve">, </w:t>
-      </w:r>
-      <w:r>
-        <w:rPr>
-          <w:rFonts w:ascii="Noto Serif SC" w:eastAsia="Noto Serif SC" w:hAnsi="Noto Serif SC" w:cs="Noto Serif" w:hint="eastAsia"/>
-          <w:lang w:val="en-US"/>
-        </w:rPr>
-        <w:t>中音</w:t>
-      </w:r>
-      <w:r>
-        <w:rPr>
-          <w:rFonts w:ascii="Noto Serif SC" w:eastAsia="Noto Serif SC" w:hAnsi="Noto Serif SC" w:cs="Noto Serif" w:hint="eastAsia"/>
-        </w:rPr>
-        <w:t>管</w:t>
-      </w:r>
-      <w:r>
-        <w:rPr>
-          <w:rFonts w:ascii="Noto Serif SC" w:eastAsia="Noto Serif SC" w:hAnsi="Noto Serif SC" w:cs="Noto Serif"/>
-          <w:lang w:val="en-US"/>
-        </w:rPr>
-        <w:t xml:space="preserve"> Zhongyin </w:t>
-      </w:r>
-      <w:r>
-        <w:rPr>
-          <w:rFonts w:ascii="Noto Serif SC" w:eastAsia="Noto Serif SC" w:hAnsi="Noto Serif SC" w:cs="Noto Serif"/>
-          <w:lang w:val="en-US"/>
-        </w:rPr>
-        <w:t>Guan</w:t>
       </w:r>
     </w:p>
     <w:p>
@@ -7218,7 +7394,7 @@
           <w:noProof/>
         </w:rPr>
         <w:pict w14:anchorId="62D7E167">
-          <v:shape id="Picture 7" o:spid="_x0000_i1027" type="#_x0000_t75" alt="A black background with a black square&#10;&#10;&#10;&#10;&#10;&#10;&#10;&#10;&#10;&#10;&#10;&#10;&#10;&#10;&#10;&#10;&#10;&#10;&#10;&#10;&#10;&#10;&#10;&#10;Description automatically generated with medium confidence" style="width:8.35pt;height:13.4pt;visibility:visible;mso-wrap-style:square;mso-width-percent:0;mso-height-percent:0;mso-width-percent:0;mso-height-percent:0">
+          <v:shape id="Picture 7" o:spid="_x0000_i1027" type="#_x0000_t75" alt="A black background with a black square&#10;&#10;&#10;&#10;&#10;&#10;&#10;&#10;&#10;&#10;&#10;&#10;&#10;&#10;&#10;&#10;&#10;&#10;&#10;&#10;&#10;&#10;&#10;&#10;Description automatically generated with medium confidence" style="width:8.6pt;height:13.45pt;visibility:visible;mso-wrap-style:square;mso-width-percent:0;mso-height-percent:0;mso-width-percent:0;mso-height-percent:0">
             <v:imagedata r:id="rId19" o:title="A black background with a black square&#10;&#10;&#10;&#10;&#10;&#10;&#10;&#10;&#10;&#10;&#10;&#10;&#10;&#10;&#10;&#10;&#10;&#10;&#10;&#10;&#10;&#10;&#10;&#10;Description automatically generated with medium confidence"/>
           </v:shape>
         </w:pict>
@@ -7902,7 +8078,7 @@
           <w:szCs w:val="21"/>
         </w:rPr>
         <w:drawing>
-          <wp:anchor distT="0" distB="0" distL="114300" distR="114300" simplePos="0" relativeHeight="251660288" behindDoc="0" locked="0" layoutInCell="1" allowOverlap="1" wp14:anchorId="4530C89D" wp14:editId="0F76E920">
+          <wp:anchor distT="0" distB="0" distL="114300" distR="114300" simplePos="0" relativeHeight="251660288" behindDoc="0" locked="0" layoutInCell="1" allowOverlap="1" wp14:anchorId="4530C89D" wp14:editId="1DB5034B">
             <wp:simplePos x="0" y="0"/>
             <wp:positionH relativeFrom="column">
               <wp:posOffset>958850</wp:posOffset>
@@ -11738,14 +11914,14 @@
         <v:path o:extrusionok="f" gradientshapeok="t" o:connecttype="rect"/>
         <o:lock v:ext="edit" aspectratio="t"/>
       </v:shapetype>
-      <v:shape id="_x0000_i1034" type="#_x0000_t75" alt="A black background with a black square&#10;&#10;&#10;&#10;&#10;&#10;&#10;&#10;&#10;&#10;&#10;&#10;&#10;&#10;&#10;&#10;&#10;&#10;&#10;&#10;&#10;&#10;&#10;&#10;Description automatically generated with medium confidence" style="width:3in;height:523.25pt;visibility:visible;mso-wrap-style:square" o:bullet="t">
+      <v:shape id="_x0000_i1048" type="#_x0000_t75" alt="A black background with a black square&#10;&#10;&#10;&#10;&#10;&#10;&#10;&#10;&#10;&#10;&#10;&#10;&#10;&#10;&#10;&#10;&#10;&#10;&#10;&#10;&#10;&#10;&#10;&#10;Description automatically generated with medium confidence" style="width:3in;height:523.35pt;visibility:visible;mso-wrap-style:square" o:bullet="t">
         <v:imagedata r:id="rId1" o:title="A black background with a black square&#10;&#10;&#10;&#10;&#10;&#10;&#10;&#10;&#10;&#10;&#10;&#10;&#10;&#10;&#10;&#10;&#10;&#10;&#10;&#10;&#10;&#10;&#10;&#10;Description automatically generated with medium confidence"/>
       </v:shape>
     </w:pict>
   </w:numPicBullet>
   <w:numPicBullet w:numPicBulletId="1">
     <w:pict>
-      <v:shape id="_x0000_i1035" type="#_x0000_t75" style="width:276.3pt;height:422.8pt;flip:x;visibility:visible;mso-wrap-style:square" o:bullet="t">
+      <v:shape id="_x0000_i1049" type="#_x0000_t75" style="width:276.2pt;height:422.85pt;flip:x;visibility:visible;mso-wrap-style:square" o:bullet="t">
         <v:imagedata r:id="rId2" o:title=""/>
       </v:shape>
     </w:pict>

</xml_diff>